<commit_message>
chore: adjust postclock docx display stucture
</commit_message>
<xml_diff>
--- a/frontend/public/templates/postClockRequest.docx
+++ b/frontend/public/templates/postClockRequest.docx
@@ -482,6 +482,14 @@
               <w:rPr>
                 <w:rFonts w:ascii="標楷體" w:eastAsia="標楷體" w:hAnsi="標楷體"/>
               </w:rPr>
+              <w:br/>
+            </w:r>
+            <w:bookmarkStart w:id="0" w:name="_GoBack"/>
+            <w:bookmarkEnd w:id="0"/>
+            <w:r>
+              <w:rPr>
+                <w:rFonts w:ascii="標楷體" w:eastAsia="標楷體" w:hAnsi="標楷體"/>
+              </w:rPr>
               <w:t>{time2}</w:t>
             </w:r>
           </w:p>
@@ -591,6 +599,24 @@
                 <w:rFonts w:ascii="標楷體" w:eastAsia="標楷體" w:hAnsi="標楷體"/>
               </w:rPr>
             </w:pPr>
+            <w:r>
+              <w:rPr>
+                <w:rFonts w:ascii="標楷體" w:eastAsia="標楷體" w:hAnsi="標楷體"/>
+              </w:rPr>
+              <w:t>{</w:t>
+            </w:r>
+            <w:r>
+              <w:rPr>
+                <w:rFonts w:ascii="標楷體" w:eastAsia="標楷體" w:hAnsi="標楷體"/>
+              </w:rPr>
+              <w:t>witnessName</w:t>
+            </w:r>
+            <w:r>
+              <w:rPr>
+                <w:rFonts w:ascii="標楷體" w:eastAsia="標楷體" w:hAnsi="標楷體"/>
+              </w:rPr>
+              <w:t>}</w:t>
+            </w:r>
           </w:p>
         </w:tc>
         <w:tc>
@@ -646,8 +672,6 @@
               </w:rPr>
               <w:t>人事</w:t>
             </w:r>
-            <w:bookmarkStart w:id="0" w:name="_GoBack"/>
-            <w:bookmarkEnd w:id="0"/>
           </w:p>
         </w:tc>
         <w:tc>

</xml_diff>

<commit_message>
v1.18.1 Post-Clock DOCX Shows Approving Manager's Name
</commit_message>
<xml_diff>
--- a/frontend/public/templates/postClockRequest.docx
+++ b/frontend/public/templates/postClockRequest.docx
@@ -484,8 +484,6 @@
               </w:rPr>
               <w:br/>
             </w:r>
-            <w:bookmarkStart w:id="0" w:name="_GoBack"/>
-            <w:bookmarkEnd w:id="0"/>
             <w:r>
               <w:rPr>
                 <w:rFonts w:ascii="標楷體" w:eastAsia="標楷體" w:hAnsi="標楷體"/>
@@ -648,10 +646,31 @@
           </w:tcPr>
           <w:p>
             <w:pPr>
-              <w:rPr>
-                <w:rFonts w:ascii="標楷體" w:eastAsia="標楷體" w:hAnsi="標楷體"/>
-              </w:rPr>
-            </w:pPr>
+              <w:jc w:val="center"/>
+              <w:rPr>
+                <w:rFonts w:ascii="標楷體" w:eastAsia="標楷體" w:hAnsi="標楷體"/>
+              </w:rPr>
+            </w:pPr>
+            <w:r>
+              <w:rPr>
+                <w:rFonts w:ascii="標楷體" w:eastAsia="標楷體" w:hAnsi="標楷體"/>
+              </w:rPr>
+              <w:t>{manager</w:t>
+            </w:r>
+            <w:r>
+              <w:rPr>
+                <w:rFonts w:ascii="標楷體" w:eastAsia="標楷體" w:hAnsi="標楷體"/>
+              </w:rPr>
+              <w:t>Name</w:t>
+            </w:r>
+            <w:bookmarkStart w:id="0" w:name="_GoBack"/>
+            <w:bookmarkEnd w:id="0"/>
+            <w:r>
+              <w:rPr>
+                <w:rFonts w:ascii="標楷體" w:eastAsia="標楷體" w:hAnsi="標楷體"/>
+              </w:rPr>
+              <w:t>}</w:t>
+            </w:r>
           </w:p>
         </w:tc>
         <w:tc>

</xml_diff>